<commit_message>
KEL tsr ready for printing and dispatching
</commit_message>
<xml_diff>
--- a/kel-17380-MIK/KE17380-TSQ-26-01.docx
+++ b/kel-17380-MIK/KE17380-TSQ-26-01.docx
@@ -180,25 +180,7 @@
           <w:szCs w:val="20"/>
           <w:u w:val="none"/>
         </w:rPr>
-        <w:t xml:space="preserve">March </w:t>
-      </w:r>
-      <w:r>
-        <w:rPr>
-          <w:color w:val="auto"/>
-          <w:sz w:val="20"/>
-          <w:szCs w:val="20"/>
-          <w:u w:val="none"/>
-        </w:rPr>
-        <w:t>14</w:t>
-      </w:r>
-      <w:r>
-        <w:rPr>
-          <w:color w:val="auto"/>
-          <w:sz w:val="20"/>
-          <w:szCs w:val="20"/>
-          <w:u w:val="none"/>
-        </w:rPr>
-        <w:t>, 2025</w:t>
+        <w:t>March 14, 2025</w:t>
       </w:r>
     </w:p>
     <w:p>
@@ -491,24 +473,6 @@
         </w:rPr>
         <w:fldChar w:fldCharType="end"/>
       </w:r>
-      <w:r>
-        <w:rPr>
-          <w:b/>
-          <w:bCs/>
-          <w:sz w:val="20"/>
-          <w:szCs w:val="20"/>
-        </w:rPr>
-        <w:t xml:space="preserve">, </w:t>
-      </w:r>
-      <w:r>
-        <w:rPr>
-          <w:b/>
-          <w:bCs/>
-          <w:sz w:val="20"/>
-          <w:szCs w:val="20"/>
-        </w:rPr>
-        <w:t>17379, 17381</w:t>
-      </w:r>
     </w:p>
     <w:p>
       <w:pPr>
@@ -781,6 +745,28 @@
       </w:pPr>
       <w:r>
         <w:rPr>
+          <w:sz w:val="20"/>
+          <w:szCs w:val="20"/>
+        </w:rPr>
+      </w:r>
+    </w:p>
+    <w:p>
+      <w:pPr>
+        <w:pStyle w:val="Default"/>
+        <w:tabs>
+          <w:tab w:val="clear" w:pos="720"/>
+          <w:tab w:val="left" w:pos="400" w:leader="none"/>
+        </w:tabs>
+        <w:bidi w:val="0"/>
+        <w:jc w:val="start"/>
+        <w:rPr>
+          <w:rFonts w:ascii="Calibri" w:hAnsi="Calibri"/>
+          <w:sz w:val="20"/>
+          <w:szCs w:val="20"/>
+        </w:rPr>
+      </w:pPr>
+      <w:r>
+        <w:rPr>
           <w:b w:val="false"/>
           <w:strike w:val="false"/>
           <w:dstrike w:val="false"/>
@@ -789,106 +775,7 @@
           <w:szCs w:val="20"/>
           <w:u w:val="none"/>
         </w:rPr>
-      </w:r>
-    </w:p>
-    <w:p>
-      <w:pPr>
-        <w:pStyle w:val="Default"/>
-        <w:tabs>
-          <w:tab w:val="clear" w:pos="720"/>
-          <w:tab w:val="left" w:pos="400" w:leader="none"/>
-        </w:tabs>
-        <w:bidi w:val="0"/>
-        <w:jc w:val="start"/>
-        <w:rPr>
-          <w:rFonts w:ascii="Calibri" w:hAnsi="Calibri"/>
-          <w:sz w:val="20"/>
-          <w:szCs w:val="20"/>
-        </w:rPr>
-      </w:pPr>
-      <w:r>
-        <w:rPr>
-          <w:b w:val="false"/>
-          <w:strike w:val="false"/>
-          <w:dstrike w:val="false"/>
-          <w:color w:val="auto"/>
-          <w:sz w:val="20"/>
-          <w:szCs w:val="20"/>
-          <w:u w:val="none"/>
-        </w:rPr>
-        <w:t xml:space="preserve">Moving forward </w:t>
-      </w:r>
-      <w:r>
-        <w:rPr>
-          <w:b w:val="false"/>
-          <w:strike w:val="false"/>
-          <w:dstrike w:val="false"/>
-          <w:color w:val="auto"/>
-          <w:sz w:val="20"/>
-          <w:szCs w:val="20"/>
-          <w:u w:val="none"/>
-        </w:rPr>
-        <w:t xml:space="preserve">to achieving </w:t>
-      </w:r>
-      <w:r>
-        <w:rPr>
-          <w:b w:val="false"/>
-          <w:strike w:val="false"/>
-          <w:dstrike w:val="false"/>
-          <w:color w:val="auto"/>
-          <w:sz w:val="20"/>
-          <w:szCs w:val="20"/>
-          <w:u w:val="none"/>
-        </w:rPr>
-        <w:t>and</w:t>
-      </w:r>
-      <w:r>
-        <w:rPr>
-          <w:b w:val="false"/>
-          <w:strike w:val="false"/>
-          <w:dstrike w:val="false"/>
-          <w:color w:val="auto"/>
-          <w:sz w:val="20"/>
-          <w:szCs w:val="20"/>
-          <w:u w:val="none"/>
-        </w:rPr>
-        <w:t xml:space="preserve"> converting the physical shares into Book Entry form please </w:t>
-      </w:r>
-      <w:r>
-        <w:rPr>
-          <w:b w:val="false"/>
-          <w:strike w:val="false"/>
-          <w:dstrike w:val="false"/>
-          <w:color w:val="auto"/>
-          <w:sz w:val="20"/>
-          <w:szCs w:val="20"/>
-          <w:u w:val="none"/>
-        </w:rPr>
-        <w:t>dispatch a sys</w:t>
-      </w:r>
-      <w:r>
-        <w:rPr>
-          <w:b w:val="false"/>
-          <w:strike w:val="false"/>
-          <w:dstrike w:val="false"/>
-          <w:color w:val="auto"/>
-          <w:sz w:val="20"/>
-          <w:szCs w:val="20"/>
-          <w:u w:val="none"/>
-        </w:rPr>
-        <w:t xml:space="preserve">tem generated Form of Transfer of Shares </w:t>
-      </w:r>
-      <w:r>
-        <w:rPr>
-          <w:b w:val="false"/>
-          <w:strike w:val="false"/>
-          <w:dstrike w:val="false"/>
-          <w:color w:val="auto"/>
-          <w:sz w:val="20"/>
-          <w:szCs w:val="20"/>
-          <w:u w:val="none"/>
-        </w:rPr>
-        <w:t>for the legal heirs’ signature verification.</w:t>
+        <w:t>Moving forward to achieving and converting the physical shares into Book Entry form please dispatch a system generated Form of Transfer of Shares for the legal heirs’ signature verification.</w:t>
       </w:r>
     </w:p>
     <w:p>
@@ -2633,7 +2520,7 @@
     <w:pPr>
       <w:widowControl/>
       <w:suppressAutoHyphens w:val="true"/>
-      <w:overflowPunct w:val="false"/>
+      <w:overflowPunct w:val="true"/>
       <w:bidi w:val="0"/>
       <w:snapToGrid w:val="false"/>
       <w:spacing w:before="0" w:after="0"/>
@@ -2685,8 +2572,8 @@
       <w:bCs/>
     </w:rPr>
   </w:style>
-  <w:style w:type="character" w:styleId="Bulletsuser">
-    <w:name w:val="Bullets (user)"/>
+  <w:style w:type="character" w:styleId="Bullets">
+    <w:name w:val="Bullets"/>
     <w:qFormat/>
     <w:rPr>
       <w:rFonts w:ascii="OpenSymbol" w:hAnsi="OpenSymbol" w:eastAsia="OpenSymbol" w:cs="OpenSymbol"/>
@@ -2789,7 +2676,7 @@
     <w:pPr>
       <w:widowControl/>
       <w:suppressAutoHyphens w:val="true"/>
-      <w:overflowPunct w:val="false"/>
+      <w:overflowPunct w:val="true"/>
       <w:bidi w:val="0"/>
       <w:spacing w:before="0" w:after="0"/>
       <w:jc w:val="start"/>

</xml_diff>